<commit_message>
Update weekly report 8
</commit_message>
<xml_diff>
--- a/BaoCao/bao-cao-tuan/BaoCao_Tuan8.docx
+++ b/BaoCao/bao-cao-tuan/BaoCao_Tuan8.docx
@@ -299,6 +299,108 @@
           <w:p>
             <w:r>
               <w:t>-  Cập nhật README + .vscode/settings.json để ẩn các folder phụ trợ (.claude, .next, build, .gradle, .dart_tool...) cho gọn cây thư mục.</w:t>
+            </w:r>
+          </w:p>
+          <w:p>
+            <w:r>
+              <w:rPr>
+                <w:b/>
+              </w:rPr>
+              <w:t>Tối ưu hiệu năng app Flutter (giảm lag, mượt giao diện)</w:t>
+            </w:r>
+          </w:p>
+          <w:p>
+            <w:r>
+              <w:t>-  Vấn đề: app khi mở lần đầu và khi chuyển tab còn lag, ảnh load chậm, WebView trắng vài giây mới hiện.</w:t>
+            </w:r>
+          </w:p>
+          <w:p>
+            <w:r>
+              <w:t>-  Bật cache cho WebView, preload trang chính khi app khởi động ở background để khi user bấm vào tab thì hiện ngay, không phải đợi.</w:t>
+            </w:r>
+          </w:p>
+          <w:p>
+            <w:r>
+              <w:t>-  Lazy-load các tab phụ (chỉ khởi tạo WebView khi tab được mở lần đầu) — giảm RAM lúc khởi động, mở app nhanh hơn rõ rệt.</w:t>
+            </w:r>
+          </w:p>
+          <w:p>
+            <w:r>
+              <w:t>-  Trỏ thẳng URL về /nhap-hang/index.html (thay vì /nhap-hang/) để tránh redirect Vercel làm vỡ đường dẫn CSS tương đối — fix lỗi NhapHang hiện không có style trong app.</w:t>
+            </w:r>
+          </w:p>
+          <w:p>
+            <w:r>
+              <w:rPr>
+                <w:b/>
+              </w:rPr>
+              <w:t>Sửa quy ước sinh mã đơn hàng NhapHang (YYMMDD.SSNN theo trạm NHẬN)</w:t>
+            </w:r>
+          </w:p>
+          <w:p>
+            <w:r>
+              <w:t>-  Vấn đề: mã đơn cũ sinh client-side dễ trùng khi 2 nhân viên thao tác cùng lúc, và lấy nhầm theo trạm gửi nên thống kê theo trạm nhận bị lệch.</w:t>
+            </w:r>
+          </w:p>
+          <w:p>
+            <w:r>
+              <w:t>-  Đổi format mã: YYMMDD.SSNN — SS là mã trạm NHẬN từ dropdown, NN là số thứ tự trong ngày. Server sinh mã chính thức qua atomic upsert vào bảng counters → không bao giờ trùng kể cả khi nhập song song.</w:t>
+            </w:r>
+          </w:p>
+          <w:p>
+            <w:r>
+              <w:t>-  Client chỉ gọi GET /api/nhap-hang/counters?station=XX để preview mã sắp tới, mã thật do server cấp lúc POST → tránh race condition.</w:t>
+            </w:r>
+          </w:p>
+          <w:p>
+            <w:r>
+              <w:rPr>
+                <w:b/>
+              </w:rPr>
+              <w:t>Soft-delete đơn hàng + audit log người sửa (NhapHang)</w:t>
+            </w:r>
+          </w:p>
+          <w:p>
+            <w:r>
+              <w:t>-  Vấn đề: nút "Xóa" trước đây xoá vĩnh viễn → mất dấu vết, khó tra cứu khi khách khiếu nại.</w:t>
+            </w:r>
+          </w:p>
+          <w:p>
+            <w:r>
+              <w:t>-  Đổi sang soft-delete: bấm Xóa thực ra set status=cancelled, có modal ghi chú lý do hủy. Đơn hủy hiển thị màu xám + gạch ngang, không cho chỉnh sửa/in, không tính vào doanh thu/thống kê dashboard.</w:t>
+            </w:r>
+          </w:p>
+          <w:p>
+            <w:r>
+              <w:t>-  Gắn audit log: mỗi lần update/delete đều gửi changedBy lấy từ user đang đăng nhập → tra ra ai sửa đơn nào lúc nào trong bảng productlogs.</w:t>
+            </w:r>
+          </w:p>
+          <w:p>
+            <w:r>
+              <w:rPr>
+                <w:b/>
+              </w:rPr>
+              <w:t>Hệ thống phân quyền + đăng nhập cho 2 module (NhapHang &amp; TongHop)</w:t>
+            </w:r>
+          </w:p>
+          <w:p>
+            <w:r>
+              <w:t>-  Thêm cột permissions JSONB vào bảng Users của cả 2 DB, kèm scope theo trạm (mỗi user chỉ thấy đơn của trạm mình, trừ admin global).</w:t>
+            </w:r>
+          </w:p>
+          <w:p>
+            <w:r>
+              <w:t>-  TongHop: 15 quyền chi tiết (xem booking, sửa booking, hủy, chuyển ghế, quản lý route, quản lý xe, xem doanh thu, quản lý user…) — JWT mang theo permissions, hàm hasPerm() check ở mỗi route.</w:t>
+            </w:r>
+          </w:p>
+          <w:p>
+            <w:r>
+              <w:t>-  NhapHang: helper hasPerm() + hasGlobalStationAccess() phân biệt user trạm vs admin tổng. Mật khẩu cũ plain-text tự rehash sang bcrypt khi user đăng nhập lần đầu — migrate dần không cần reset password.</w:t>
+            </w:r>
+          </w:p>
+          <w:p>
+            <w:r>
+              <w:t>-  Trang /quan-ly-user (admin only) cho phép tick chọn quyền + đổi scope trạm bằng UI, không cần SQL tay.</w:t>
             </w:r>
           </w:p>
         </w:tc>

</xml_diff>

<commit_message>
Fix TongHop column status/active missing: auto ALTER TH_Bookings + TH_Users
</commit_message>
<xml_diff>
--- a/BaoCao/bao-cao-tuan/BaoCao_Tuan8.docx
+++ b/BaoCao/bao-cao-tuan/BaoCao_Tuan8.docx
@@ -12,18 +12,6 @@
           <w:sz w:val="28"/>
         </w:rPr>
         <w:t>BÁO CÁO TUẦN 8</w:t>
-      </w:r>
-      <w:r>
-        <w:rPr>
-          <w:b/>
-          <w:sz w:val="28"/>
-        </w:rPr>
-      </w:r>
-      <w:r>
-        <w:rPr>
-          <w:b/>
-          <w:sz w:val="28"/>
-        </w:rPr>
       </w:r>
     </w:p>
     <w:p/>
@@ -58,25 +46,7 @@
               <w:rPr>
                 <w:b/>
               </w:rPr>
-              <w:t>Tu</w:t>
-            </w:r>
-            <w:r>
-              <w:rPr>
-                <w:b/>
-              </w:rPr>
-              <w:t>ầ</w:t>
-            </w:r>
-            <w:r>
-              <w:rPr>
-                <w:b/>
-              </w:rPr>
-              <w:t>n l</w:t>
-            </w:r>
-            <w:r>
-              <w:rPr>
-                <w:b/>
-              </w:rPr>
-              <w:t>ễ</w:t>
+              <w:t>Tuần lễ</w:t>
             </w:r>
           </w:p>
         </w:tc>
@@ -122,19 +92,7 @@
               <w:rPr>
                 <w:b/>
               </w:rPr>
-              <w:t>N</w:t>
-            </w:r>
-            <w:r>
-              <w:rPr>
-                <w:b/>
-              </w:rPr>
-              <w:t>ộ</w:t>
-            </w:r>
-            <w:r>
-              <w:rPr>
-                <w:b/>
-              </w:rPr>
-              <w:t>i dung</w:t>
+              <w:t>Nội dung</w:t>
             </w:r>
           </w:p>
         </w:tc>
@@ -183,225 +141,2719 @@
               <w:right w:val="single" w:sz="6" w:space="0" w:color="000000"/>
             </w:tcBorders>
           </w:tcPr>
-          <w:bookmarkEnd w:id="0"/>
           <w:p>
             <w:r>
               <w:rPr>
                 <w:b/>
               </w:rPr>
-              <w:t>Tool tự động đồng bộ đơn hàng từ O2BSoft sang NhapHang (Tampermonkey userscript)</w:t>
-            </w:r>
-          </w:p>
-          <w:p>
-            <w:r>
-              <w:t>-  Vấn đề: mỗi ngày nhân viên trạm An Đông phải mở web O2BSoft xem danh sách đơn rồi gõ tay lại vào hệ thống NhapHang — tốn thời gian, dễ sai số liệu, dễ sót đơn.</w:t>
-            </w:r>
-          </w:p>
-          <w:p>
-            <w:r>
-              <w:t>-  Viết userscript chạy trên trình duyệt: tự đọc bảng đơn hàng O2BSoft (parse DOM + chuẩn hoá tiếng Việt không dấu), POST sang API /api/nhap-hang/products để đồng bộ.</w:t>
-            </w:r>
-          </w:p>
-          <w:p>
-            <w:r>
-              <w:t>-  Auto polling 20 giây quét đơn mới + auto reload trang O2BSoft 60 giây để không bị logout, có cơ chế tự đăng nhập lại khi rớt phiên.</w:t>
-            </w:r>
-          </w:p>
-          <w:p>
-            <w:r>
-              <w:t>-  Hỗ trợ phân trang: bấm 1 nút Sync là tự fetch song song các trang còn lại để đồng bộ hết, không bị kẹt ở trang 1.</w:t>
-            </w:r>
-          </w:p>
-          <w:p>
-            <w:r>
-              <w:t>-  Cố định trạm gửi (senderStation) = An Đông cho mọi đơn O2BSoft vì nguồn dữ liệu chỉ thuộc trạm An Đông, tránh sai trạm khi đồng bộ.</w:t>
-            </w:r>
-          </w:p>
-          <w:p>
+              <w:t>Tool t</w:t>
+            </w:r>
             <w:r>
               <w:rPr>
                 <w:b/>
               </w:rPr>
-              <w:t>Đóng gói 2 app Flutter (khách + nội bộ) — đổi logo, xin quyền, ký APK</w:t>
-            </w:r>
-          </w:p>
-          <w:p>
-            <w:r>
-              <w:t>-  Tách thành 2 app riêng: VCP Đặt Vé (khách, không cần đăng nhập, mở thẳng trang đặt vé) và app nội bộ (có login + 3 tab: Đặt Vé / Nhập Hàng / Tổng Hợp).</w:t>
-            </w:r>
-          </w:p>
-          <w:p>
-            <w:r>
-              <w:t>-  Thay logo Flutter mặc định bằng logo Võ Cúc Phương cho cả 2 app (sinh đủ density cho Android).</w:t>
-            </w:r>
-          </w:p>
-          <w:p>
-            <w:r>
-              <w:t>-  Thêm xin quyền camera (quét QR vé), điện thoại (gọi khách trực tiếp từ app), vị trí (gợi ý điểm đón) — kèm callback onPlatformPermissionRequest cho WebView để camera hoạt động được trong webview.</w:t>
-            </w:r>
-          </w:p>
-          <w:p>
-            <w:r>
-              <w:t>-  Tắt autofill và các gợi ý tự động gây khó chịu khi nhập liệu.</w:t>
-            </w:r>
-          </w:p>
-          <w:p>
-            <w:r>
-              <w:t>-  Ký APK release bằng keystore riêng (vocucphuong-release.jks) để cài máy thật, không còn debug-cert.</w:t>
-            </w:r>
-          </w:p>
-          <w:p>
+              <w:t>ự</w:t>
+            </w:r>
             <w:r>
               <w:rPr>
                 <w:b/>
               </w:rPr>
-              <w:t>Sửa lỗi trang tài xế chỉ hiện 4 xe + làm trang tin tức thân thiện hơn</w:t>
-            </w:r>
-          </w:p>
-          <w:p>
-            <w:r>
-              <w:t>-  Vấn đề: trang /driver chỉ hiện 4/N xe vì regex nhận diện biển số khớp nhầm với mã xe nội bộ (vd "28G") → bị dedup mất các xe có cùng prefix.</w:t>
-            </w:r>
-          </w:p>
-          <w:p>
-            <w:r>
-              <w:t>-  Sửa regex: bắt buộc đủ pattern \d{2}[A-Z][-\s]?\d{3,5} (2 số + 1 chữ + dấu cách + 3-5 số) và ưu tiên trường type trước code → hiện đủ toàn bộ xe trong hệ thống.</w:t>
-            </w:r>
-          </w:p>
-          <w:p>
-            <w:r>
-              <w:t>-  Trang /tin-tuc: bỏ toàn bộ icon/emoji (📰 📅 ✍️) theo nguyên tắc trang public không dùng emoji, thiết kế lại với hero gradient xanh, ô tìm kiếm, bộ lọc chuyên mục dạng pill có đếm số bài, card bo tròn + hover scale ảnh.</w:t>
-            </w:r>
-          </w:p>
-          <w:p>
-            <w:r>
-              <w:t>-  Tổng Hợp: đổi ô số điện thoại sang nền trắng chữ đen khi trạng thái "Chưa gọi" để nhân viên nhìn rõ và dễ nhấn gọi.</w:t>
-            </w:r>
-          </w:p>
-          <w:p>
+              <w:t xml:space="preserve"> đ</w:t>
+            </w:r>
             <w:r>
               <w:rPr>
                 <w:b/>
               </w:rPr>
-              <w:t>Tài liệu đồ án + tái cấu trúc thư mục monorepo</w:t>
-            </w:r>
-          </w:p>
-          <w:p>
-            <w:r>
-              <w:t>-  Viết tài liệu đồ án bằng Markdown + Mermaid: Database Schema, ERD, Use Case Diagram, Sequence Diagram, Mô tả nghiệp vụ — kèm script export-diagrams.sh tự render Mermaid thành PNG để chèn vào Word.</w:t>
-            </w:r>
-          </w:p>
-          <w:p>
-            <w:r>
-              <w:t>-  Đổi tên thống nhất toàn bộ folder root theo convention VoCucPhuong_* (VoCucPhuong_PublicWeb, VoCucPhuong_DatVe, VoCucPhuong_NhapHang, VoCucPhuong_TongHop, VoCucPhuong_BackupData, VoCucPhuong_PageOptions) + tên tiếng Việt cho tài liệu (BaoCao) và công cụ (Auto_Update_Data).</w:t>
-            </w:r>
-          </w:p>
-          <w:p>
-            <w:r>
-              <w:t>-  Cập nhật README + .vscode/settings.json để ẩn các folder phụ trợ (.claude, .next, build, .gradle, .dart_tool...) cho gọn cây thư mục.</w:t>
-            </w:r>
-          </w:p>
-          <w:p>
+              <w:t>ộ</w:t>
+            </w:r>
             <w:r>
               <w:rPr>
                 <w:b/>
               </w:rPr>
-              <w:t>Tối ưu hiệu năng app Flutter (giảm lag, mượt giao diện)</w:t>
-            </w:r>
-          </w:p>
-          <w:p>
-            <w:r>
-              <w:t>-  Vấn đề: app khi mở lần đầu và khi chuyển tab còn lag, ảnh load chậm, WebView trắng vài giây mới hiện.</w:t>
-            </w:r>
-          </w:p>
-          <w:p>
-            <w:r>
-              <w:t>-  Bật cache cho WebView, preload trang chính khi app khởi động ở background để khi user bấm vào tab thì hiện ngay, không phải đợi.</w:t>
-            </w:r>
-          </w:p>
-          <w:p>
-            <w:r>
-              <w:t>-  Lazy-load các tab phụ (chỉ khởi tạo WebView khi tab được mở lần đầu) — giảm RAM lúc khởi động, mở app nhanh hơn rõ rệt.</w:t>
-            </w:r>
-          </w:p>
-          <w:p>
-            <w:r>
-              <w:t>-  Trỏ thẳng URL về /nhap-hang/index.html (thay vì /nhap-hang/) để tránh redirect Vercel làm vỡ đường dẫn CSS tương đối — fix lỗi NhapHang hiện không có style trong app.</w:t>
-            </w:r>
-          </w:p>
-          <w:p>
+              <w:t>ng đ</w:t>
+            </w:r>
             <w:r>
               <w:rPr>
                 <w:b/>
               </w:rPr>
-              <w:t>Sửa quy ước sinh mã đơn hàng NhapHang (YYMMDD.SSNN theo trạm NHẬN)</w:t>
-            </w:r>
-          </w:p>
-          <w:p>
-            <w:r>
-              <w:t>-  Vấn đề: mã đơn cũ sinh client-side dễ trùng khi 2 nhân viên thao tác cùng lúc, và lấy nhầm theo trạm gửi nên thống kê theo trạm nhận bị lệch.</w:t>
-            </w:r>
-          </w:p>
-          <w:p>
-            <w:r>
-              <w:t>-  Đổi format mã: YYMMDD.SSNN — SS là mã trạm NHẬN từ dropdown, NN là số thứ tự trong ngày. Server sinh mã chính thức qua atomic upsert vào bảng counters → không bao giờ trùng kể cả khi nhập song song.</w:t>
-            </w:r>
-          </w:p>
-          <w:p>
-            <w:r>
-              <w:t>-  Client chỉ gọi GET /api/nhap-hang/counters?station=XX để preview mã sắp tới, mã thật do server cấp lúc POST → tránh race condition.</w:t>
-            </w:r>
-          </w:p>
-          <w:p>
+              <w:t>ồ</w:t>
+            </w:r>
             <w:r>
               <w:rPr>
                 <w:b/>
               </w:rPr>
-              <w:t>Soft-delete đơn hàng + audit log người sửa (NhapHang)</w:t>
-            </w:r>
-          </w:p>
-          <w:p>
-            <w:r>
-              <w:t>-  Vấn đề: nút "Xóa" trước đây xoá vĩnh viễn → mất dấu vết, khó tra cứu khi khách khiếu nại.</w:t>
-            </w:r>
-          </w:p>
-          <w:p>
-            <w:r>
-              <w:t>-  Đổi sang soft-delete: bấm Xóa thực ra set status=cancelled, có modal ghi chú lý do hủy. Đơn hủy hiển thị màu xám + gạch ngang, không cho chỉnh sửa/in, không tính vào doanh thu/thống kê dashboard.</w:t>
-            </w:r>
-          </w:p>
-          <w:p>
-            <w:r>
-              <w:t>-  Gắn audit log: mỗi lần update/delete đều gửi changedBy lấy từ user đang đăng nhập → tra ra ai sửa đơn nào lúc nào trong bảng productlogs.</w:t>
-            </w:r>
-          </w:p>
-          <w:p>
+              <w:t>ng b</w:t>
+            </w:r>
             <w:r>
               <w:rPr>
                 <w:b/>
               </w:rPr>
-              <w:t>Hệ thống phân quyền + đăng nhập cho 2 module (NhapHang &amp; TongHop)</w:t>
+              <w:t>ộ</w:t>
+            </w:r>
+            <w:r>
+              <w:rPr>
+                <w:b/>
+              </w:rPr>
+              <w:t xml:space="preserve"> đơn hàng t</w:t>
+            </w:r>
+            <w:r>
+              <w:rPr>
+                <w:b/>
+              </w:rPr>
+              <w:t>ừ</w:t>
+            </w:r>
+            <w:r>
+              <w:rPr>
+                <w:b/>
+              </w:rPr>
+              <w:t xml:space="preserve"> O2BSoft sang NhapHang (Tampermonkey userscript)</w:t>
             </w:r>
           </w:p>
           <w:p>
             <w:r>
-              <w:t>-  Thêm cột permissions JSONB vào bảng Users của cả 2 DB, kèm scope theo trạm (mỗi user chỉ thấy đơn của trạm mình, trừ admin global).</w:t>
+              <w:t>-  V</w:t>
+            </w:r>
+            <w:r>
+              <w:t>ấ</w:t>
+            </w:r>
+            <w:r>
+              <w:t>n đ</w:t>
+            </w:r>
+            <w:r>
+              <w:t>ề</w:t>
+            </w:r>
+            <w:r>
+              <w:t>: m</w:t>
+            </w:r>
+            <w:r>
+              <w:t>ỗ</w:t>
+            </w:r>
+            <w:r>
+              <w:t>i ngày nhân viên tr</w:t>
+            </w:r>
+            <w:r>
+              <w:t>ạ</w:t>
+            </w:r>
+            <w:r>
+              <w:t>m An Đông ph</w:t>
+            </w:r>
+            <w:r>
+              <w:t>ả</w:t>
+            </w:r>
+            <w:r>
+              <w:t>i m</w:t>
+            </w:r>
+            <w:r>
+              <w:t>ở</w:t>
+            </w:r>
+            <w:r>
+              <w:t xml:space="preserve"> web O2BSoft xem danh sách đơn r</w:t>
+            </w:r>
+            <w:r>
+              <w:t>ồ</w:t>
+            </w:r>
+            <w:r>
+              <w:t>i gõ tay l</w:t>
+            </w:r>
+            <w:r>
+              <w:t>ạ</w:t>
+            </w:r>
+            <w:r>
+              <w:t>i vào h</w:t>
+            </w:r>
+            <w:r>
+              <w:t>ệ</w:t>
+            </w:r>
+            <w:r>
+              <w:t xml:space="preserve"> th</w:t>
+            </w:r>
+            <w:r>
+              <w:t>ố</w:t>
+            </w:r>
+            <w:r>
+              <w:t xml:space="preserve">ng </w:t>
+            </w:r>
+            <w:r>
+              <w:t>NhapHang — t</w:t>
+            </w:r>
+            <w:r>
+              <w:t>ố</w:t>
+            </w:r>
+            <w:r>
+              <w:t>n th</w:t>
+            </w:r>
+            <w:r>
+              <w:t>ờ</w:t>
+            </w:r>
+            <w:r>
+              <w:t>i gian, d</w:t>
+            </w:r>
+            <w:r>
+              <w:t>ễ</w:t>
+            </w:r>
+            <w:r>
+              <w:t xml:space="preserve"> sai s</w:t>
+            </w:r>
+            <w:r>
+              <w:t>ố</w:t>
+            </w:r>
+            <w:r>
+              <w:t xml:space="preserve"> li</w:t>
+            </w:r>
+            <w:r>
+              <w:t>ệ</w:t>
+            </w:r>
+            <w:r>
+              <w:t>u, d</w:t>
+            </w:r>
+            <w:r>
+              <w:t>ễ</w:t>
+            </w:r>
+            <w:r>
+              <w:t xml:space="preserve"> sót đơn.</w:t>
             </w:r>
           </w:p>
           <w:p>
             <w:r>
-              <w:t>-  TongHop: 15 quyền chi tiết (xem booking, sửa booking, hủy, chuyển ghế, quản lý route, quản lý xe, xem doanh thu, quản lý user…) — JWT mang theo permissions, hàm hasPerm() check ở mỗi route.</w:t>
+              <w:t>-  Vi</w:t>
+            </w:r>
+            <w:r>
+              <w:t>ế</w:t>
+            </w:r>
+            <w:r>
+              <w:t>t userscript ch</w:t>
+            </w:r>
+            <w:r>
+              <w:t>ạ</w:t>
+            </w:r>
+            <w:r>
+              <w:t>y trên trình duy</w:t>
+            </w:r>
+            <w:r>
+              <w:t>ệ</w:t>
+            </w:r>
+            <w:r>
+              <w:t>t: t</w:t>
+            </w:r>
+            <w:r>
+              <w:t>ự</w:t>
+            </w:r>
+            <w:r>
+              <w:t xml:space="preserve"> đ</w:t>
+            </w:r>
+            <w:r>
+              <w:t>ọ</w:t>
+            </w:r>
+            <w:r>
+              <w:t>c b</w:t>
+            </w:r>
+            <w:r>
+              <w:t>ả</w:t>
+            </w:r>
+            <w:r>
+              <w:t>ng đơn hàng O2BSoft (parse DOM + chu</w:t>
+            </w:r>
+            <w:r>
+              <w:t>ẩ</w:t>
+            </w:r>
+            <w:r>
+              <w:t>n hoá ti</w:t>
+            </w:r>
+            <w:r>
+              <w:t>ế</w:t>
+            </w:r>
+            <w:r>
+              <w:t>ng Vi</w:t>
+            </w:r>
+            <w:r>
+              <w:t>ệ</w:t>
+            </w:r>
+            <w:r>
+              <w:t>t không d</w:t>
+            </w:r>
+            <w:r>
+              <w:t>ấ</w:t>
+            </w:r>
+            <w:r>
+              <w:t>u), POST sang API /api/nhap-hang/products đ</w:t>
+            </w:r>
+            <w:r>
+              <w:t>ể</w:t>
+            </w:r>
+            <w:r>
+              <w:t xml:space="preserve"> đ</w:t>
+            </w:r>
+            <w:r>
+              <w:t>ồ</w:t>
+            </w:r>
+            <w:r>
+              <w:t>ng b</w:t>
+            </w:r>
+            <w:r>
+              <w:t>ộ</w:t>
+            </w:r>
+            <w:r>
+              <w:t>.</w:t>
             </w:r>
           </w:p>
           <w:p>
             <w:r>
-              <w:t>-  NhapHang: helper hasPerm() + hasGlobalStationAccess() phân biệt user trạm vs admin tổng. Mật khẩu cũ plain-text tự rehash sang bcrypt khi user đăng nhập lần đầu — migrate dần không cần reset password.</w:t>
+              <w:t>-  Auto polling 20 giây quét đơn m</w:t>
+            </w:r>
+            <w:r>
+              <w:t>ớ</w:t>
+            </w:r>
+            <w:r>
+              <w:t>i + auto reload trang O2BSoft 60 giây đ</w:t>
+            </w:r>
+            <w:r>
+              <w:t>ể</w:t>
+            </w:r>
+            <w:r>
+              <w:t xml:space="preserve"> không b</w:t>
+            </w:r>
+            <w:r>
+              <w:t>ị</w:t>
+            </w:r>
+            <w:r>
+              <w:t xml:space="preserve"> logout, có cơ ch</w:t>
+            </w:r>
+            <w:r>
+              <w:t>ế</w:t>
+            </w:r>
+            <w:r>
+              <w:t xml:space="preserve"> t</w:t>
+            </w:r>
+            <w:r>
+              <w:t>ự</w:t>
+            </w:r>
+            <w:r>
+              <w:t xml:space="preserve"> đăng nh</w:t>
+            </w:r>
+            <w:r>
+              <w:t>ậ</w:t>
+            </w:r>
+            <w:r>
+              <w:t>p l</w:t>
+            </w:r>
+            <w:r>
+              <w:t>ạ</w:t>
+            </w:r>
+            <w:r>
+              <w:t>i khi r</w:t>
+            </w:r>
+            <w:r>
+              <w:t>ớ</w:t>
+            </w:r>
+            <w:r>
+              <w:t>t phiên.</w:t>
             </w:r>
           </w:p>
           <w:p>
             <w:r>
-              <w:t>-  Trang /quan-ly-user (admin only) cho phép tick chọn quyền + đổi scope trạm bằng UI, không cần SQL tay.</w:t>
-            </w:r>
+              <w:t>-  H</w:t>
+            </w:r>
+            <w:r>
+              <w:t>ỗ</w:t>
+            </w:r>
+            <w:r>
+              <w:t xml:space="preserve"> tr</w:t>
+            </w:r>
+            <w:r>
+              <w:t>ợ</w:t>
+            </w:r>
+            <w:r>
+              <w:t xml:space="preserve"> phân trang: b</w:t>
+            </w:r>
+            <w:r>
+              <w:t>ấ</w:t>
+            </w:r>
+            <w:r>
+              <w:t>m 1 nút Sync là t</w:t>
+            </w:r>
+            <w:r>
+              <w:t>ự</w:t>
+            </w:r>
+            <w:r>
+              <w:t xml:space="preserve"> fetch song song các trang còn l</w:t>
+            </w:r>
+            <w:r>
+              <w:t>ạ</w:t>
+            </w:r>
+            <w:r>
+              <w:t>i đ</w:t>
+            </w:r>
+            <w:r>
+              <w:t>ể</w:t>
+            </w:r>
+            <w:r>
+              <w:t xml:space="preserve"> đ</w:t>
+            </w:r>
+            <w:r>
+              <w:t>ồ</w:t>
+            </w:r>
+            <w:r>
+              <w:t>ng b</w:t>
+            </w:r>
+            <w:r>
+              <w:t>ộ</w:t>
+            </w:r>
+            <w:r>
+              <w:t xml:space="preserve"> h</w:t>
+            </w:r>
+            <w:r>
+              <w:t>ế</w:t>
+            </w:r>
+            <w:r>
+              <w:t>t, không b</w:t>
+            </w:r>
+            <w:r>
+              <w:t>ị</w:t>
+            </w:r>
+            <w:r>
+              <w:t xml:space="preserve"> k</w:t>
+            </w:r>
+            <w:r>
+              <w:t>ẹ</w:t>
+            </w:r>
+            <w:r>
+              <w:t xml:space="preserve">t </w:t>
+            </w:r>
+            <w:r>
+              <w:t>ở</w:t>
+            </w:r>
+            <w:r>
+              <w:t xml:space="preserve"> trang 1.</w:t>
+            </w:r>
+          </w:p>
+          <w:p>
+            <w:r>
+              <w:t>-  C</w:t>
+            </w:r>
+            <w:r>
+              <w:t>ố</w:t>
+            </w:r>
+            <w:r>
+              <w:t xml:space="preserve"> đ</w:t>
+            </w:r>
+            <w:r>
+              <w:t>ị</w:t>
+            </w:r>
+            <w:r>
+              <w:t>nh tr</w:t>
+            </w:r>
+            <w:r>
+              <w:t>ạ</w:t>
+            </w:r>
+            <w:r>
+              <w:t>m g</w:t>
+            </w:r>
+            <w:r>
+              <w:t>ử</w:t>
+            </w:r>
+            <w:r>
+              <w:t>i (senderStation) = A</w:t>
+            </w:r>
+            <w:r>
+              <w:t>n Đông cho m</w:t>
+            </w:r>
+            <w:r>
+              <w:t>ọ</w:t>
+            </w:r>
+            <w:r>
+              <w:t>i đơn O2BSoft vì ngu</w:t>
+            </w:r>
+            <w:r>
+              <w:t>ồ</w:t>
+            </w:r>
+            <w:r>
+              <w:t>n d</w:t>
+            </w:r>
+            <w:r>
+              <w:t>ữ</w:t>
+            </w:r>
+            <w:r>
+              <w:t xml:space="preserve"> li</w:t>
+            </w:r>
+            <w:r>
+              <w:t>ệ</w:t>
+            </w:r>
+            <w:r>
+              <w:t>u ch</w:t>
+            </w:r>
+            <w:r>
+              <w:t>ỉ</w:t>
+            </w:r>
+            <w:r>
+              <w:t xml:space="preserve"> thu</w:t>
+            </w:r>
+            <w:r>
+              <w:t>ộ</w:t>
+            </w:r>
+            <w:r>
+              <w:t>c tr</w:t>
+            </w:r>
+            <w:r>
+              <w:t>ạ</w:t>
+            </w:r>
+            <w:r>
+              <w:t>m An Đông, tránh sai tr</w:t>
+            </w:r>
+            <w:r>
+              <w:t>ạ</w:t>
+            </w:r>
+            <w:r>
+              <w:t>m khi đ</w:t>
+            </w:r>
+            <w:r>
+              <w:t>ồ</w:t>
+            </w:r>
+            <w:r>
+              <w:t>ng b</w:t>
+            </w:r>
+            <w:r>
+              <w:t>ộ</w:t>
+            </w:r>
+            <w:r>
+              <w:t>.</w:t>
+            </w:r>
+          </w:p>
+          <w:p>
+            <w:pPr>
+              <w:rPr>
+                <w:b/>
+                <w:bCs/>
+                <w:lang w:val="vi-VN"/>
+              </w:rPr>
+            </w:pPr>
+            <w:bookmarkStart w:id="0" w:name="OLE_LINK1"/>
+            <w:r>
+              <w:rPr>
+                <w:b/>
+                <w:bCs/>
+                <w:lang w:val="vi-VN"/>
+              </w:rPr>
+              <w:t xml:space="preserve">Tạo App và đóng gói file APK </w:t>
+            </w:r>
+          </w:p>
+          <w:p>
+            <w:r>
+              <w:t xml:space="preserve">-  </w:t>
+            </w:r>
+            <w:proofErr w:type="spellStart"/>
+            <w:r>
+              <w:t>Tách</w:t>
+            </w:r>
+            <w:proofErr w:type="spellEnd"/>
+            <w:r>
+              <w:t xml:space="preserve"> </w:t>
+            </w:r>
+            <w:proofErr w:type="spellStart"/>
+            <w:r>
+              <w:t>thành 2 a</w:t>
+            </w:r>
+            <w:proofErr w:type="spellEnd"/>
+            <w:r>
+              <w:t>pp riêng: VCP Đ</w:t>
+            </w:r>
+            <w:r>
+              <w:t>ặ</w:t>
+            </w:r>
+            <w:r>
+              <w:t>t Vé (khách, không c</w:t>
+            </w:r>
+            <w:r>
+              <w:t>ầ</w:t>
+            </w:r>
+            <w:r>
+              <w:t>n đăng nh</w:t>
+            </w:r>
+            <w:r>
+              <w:t>ậ</w:t>
+            </w:r>
+            <w:r>
+              <w:t>p, m</w:t>
+            </w:r>
+            <w:r>
+              <w:t>ở</w:t>
+            </w:r>
+            <w:r>
+              <w:t xml:space="preserve"> th</w:t>
+            </w:r>
+            <w:r>
+              <w:t>ẳ</w:t>
+            </w:r>
+            <w:r>
+              <w:t>ng trang đ</w:t>
+            </w:r>
+            <w:r>
+              <w:t>ặ</w:t>
+            </w:r>
+            <w:r>
+              <w:t xml:space="preserve">t vé) </w:t>
+            </w:r>
+            <w:r>
+              <w:t>và app n</w:t>
+            </w:r>
+            <w:r>
+              <w:t>ộ</w:t>
+            </w:r>
+            <w:r>
+              <w:t>i b</w:t>
+            </w:r>
+            <w:r>
+              <w:t>ộ</w:t>
+            </w:r>
+            <w:r>
+              <w:t xml:space="preserve"> (có login + 3 tab: Đ</w:t>
+            </w:r>
+            <w:r>
+              <w:t>ặ</w:t>
+            </w:r>
+            <w:r>
+              <w:t>t Vé / Nh</w:t>
+            </w:r>
+            <w:r>
+              <w:t>ậ</w:t>
+            </w:r>
+            <w:r>
+              <w:t>p Hàng / T</w:t>
+            </w:r>
+            <w:r>
+              <w:t>ổ</w:t>
+            </w:r>
+            <w:r>
+              <w:t>ng H</w:t>
+            </w:r>
+            <w:r>
+              <w:t>ợ</w:t>
+            </w:r>
+            <w:r>
+              <w:t>p).</w:t>
+            </w:r>
+          </w:p>
+          <w:p>
+            <w:r>
+              <w:t>-  Thay logo Flutter m</w:t>
+            </w:r>
+            <w:r>
+              <w:t>ặ</w:t>
+            </w:r>
+            <w:r>
+              <w:t>c đ</w:t>
+            </w:r>
+            <w:r>
+              <w:t>ị</w:t>
+            </w:r>
+            <w:r>
+              <w:t>nh b</w:t>
+            </w:r>
+            <w:r>
+              <w:t>ằ</w:t>
+            </w:r>
+            <w:r>
+              <w:t>ng logo Võ Cúc Phương cho c</w:t>
+            </w:r>
+            <w:r>
+              <w:t>ả</w:t>
+            </w:r>
+            <w:r>
+              <w:t xml:space="preserve"> 2 app (sinh đ</w:t>
+            </w:r>
+            <w:r>
+              <w:t>ủ</w:t>
+            </w:r>
+            <w:r>
+              <w:t xml:space="preserve"> density cho Android).</w:t>
+            </w:r>
+          </w:p>
+          <w:p>
+            <w:r>
+              <w:t>-  Thêm xin quy</w:t>
+            </w:r>
+            <w:r>
+              <w:t>ề</w:t>
+            </w:r>
+            <w:r>
+              <w:t>n camera (quét QR vé), đi</w:t>
+            </w:r>
+            <w:r>
+              <w:t>ệ</w:t>
+            </w:r>
+            <w:r>
+              <w:t>n tho</w:t>
+            </w:r>
+            <w:r>
+              <w:t>ạ</w:t>
+            </w:r>
+            <w:r>
+              <w:t>i (g</w:t>
+            </w:r>
+            <w:r>
+              <w:t>ọ</w:t>
+            </w:r>
+            <w:r>
+              <w:t>i khách tr</w:t>
+            </w:r>
+            <w:r>
+              <w:t>ự</w:t>
+            </w:r>
+            <w:r>
+              <w:t>c ti</w:t>
+            </w:r>
+            <w:r>
+              <w:t>ế</w:t>
+            </w:r>
+            <w:r>
+              <w:t>p t</w:t>
+            </w:r>
+            <w:r>
+              <w:t>ừ</w:t>
+            </w:r>
+            <w:r>
+              <w:t xml:space="preserve"> app), v</w:t>
+            </w:r>
+            <w:r>
+              <w:t>ị</w:t>
+            </w:r>
+            <w:r>
+              <w:t xml:space="preserve"> trí (g</w:t>
+            </w:r>
+            <w:r>
+              <w:t>ợ</w:t>
+            </w:r>
+            <w:r>
+              <w:t>i ý</w:t>
+            </w:r>
+            <w:r>
+              <w:t xml:space="preserve"> đi</w:t>
+            </w:r>
+            <w:r>
+              <w:t>ể</w:t>
+            </w:r>
+            <w:r>
+              <w:t>m đón) — kèm callback onPlatformPermissionRequest cho WebView đ</w:t>
+            </w:r>
+            <w:r>
+              <w:t>ể</w:t>
+            </w:r>
+            <w:r>
+              <w:t xml:space="preserve"> camera ho</w:t>
+            </w:r>
+            <w:r>
+              <w:t>ạ</w:t>
+            </w:r>
+            <w:r>
+              <w:t>t đ</w:t>
+            </w:r>
+            <w:r>
+              <w:t>ộ</w:t>
+            </w:r>
+            <w:r>
+              <w:t>ng đư</w:t>
+            </w:r>
+            <w:r>
+              <w:t>ợ</w:t>
+            </w:r>
+            <w:r>
+              <w:t>c trong webview.</w:t>
+            </w:r>
+          </w:p>
+          <w:p>
+            <w:r>
+              <w:t>-  T</w:t>
+            </w:r>
+            <w:r>
+              <w:t>ắ</w:t>
+            </w:r>
+            <w:r>
+              <w:t xml:space="preserve">t autofill và các </w:t>
+            </w:r>
+            <w:bookmarkStart w:id="1" w:name="OLE_LINK2"/>
+            <w:bookmarkEnd w:id="0"/>
+            <w:r>
+              <w:t>g</w:t>
+            </w:r>
+            <w:r>
+              <w:t>ợ</w:t>
+            </w:r>
+            <w:r>
+              <w:t>i ý t</w:t>
+            </w:r>
+            <w:r>
+              <w:t>ự</w:t>
+            </w:r>
+            <w:r>
+              <w:t xml:space="preserve"> đ</w:t>
+            </w:r>
+            <w:r>
+              <w:t>ộ</w:t>
+            </w:r>
+            <w:r>
+              <w:t>ng gây khó ch</w:t>
+            </w:r>
+            <w:r>
+              <w:t>ị</w:t>
+            </w:r>
+            <w:r>
+              <w:t>u khi nh</w:t>
+            </w:r>
+            <w:r>
+              <w:t>ậ</w:t>
+            </w:r>
+            <w:r>
+              <w:t>p li</w:t>
+            </w:r>
+            <w:r>
+              <w:t>ệ</w:t>
+            </w:r>
+            <w:r>
+              <w:t>u.</w:t>
+            </w:r>
+            <w:bookmarkEnd w:id="1"/>
+          </w:p>
+          <w:p>
+            <w:r>
+              <w:t>-  Ký APK release b</w:t>
+            </w:r>
+            <w:r>
+              <w:t>ằ</w:t>
+            </w:r>
+            <w:r>
+              <w:t xml:space="preserve">ng keystore riêng </w:t>
+            </w:r>
+            <w:r>
+              <w:t>(vocucphuong-release.jks) đ</w:t>
+            </w:r>
+            <w:r>
+              <w:t>ể</w:t>
+            </w:r>
+            <w:r>
+              <w:t xml:space="preserve"> cài máy th</w:t>
+            </w:r>
+            <w:r>
+              <w:t>ậ</w:t>
+            </w:r>
+            <w:r>
+              <w:t>t, không còn debug-cert.</w:t>
+            </w:r>
+          </w:p>
+          <w:p>
+            <w:r>
+              <w:rPr>
+                <w:b/>
+              </w:rPr>
+              <w:t>S</w:t>
+            </w:r>
+            <w:r>
+              <w:rPr>
+                <w:b/>
+              </w:rPr>
+              <w:t>ử</w:t>
+            </w:r>
+            <w:r>
+              <w:rPr>
+                <w:b/>
+              </w:rPr>
+              <w:t>a l</w:t>
+            </w:r>
+            <w:r>
+              <w:rPr>
+                <w:b/>
+              </w:rPr>
+              <w:t>ỗ</w:t>
+            </w:r>
+            <w:r>
+              <w:rPr>
+                <w:b/>
+              </w:rPr>
+              <w:t>i trang tài x</w:t>
+            </w:r>
+            <w:r>
+              <w:rPr>
+                <w:b/>
+              </w:rPr>
+              <w:t>ế</w:t>
+            </w:r>
+            <w:r>
+              <w:rPr>
+                <w:b/>
+              </w:rPr>
+              <w:t xml:space="preserve"> ch</w:t>
+            </w:r>
+            <w:r>
+              <w:rPr>
+                <w:b/>
+              </w:rPr>
+              <w:t>ỉ</w:t>
+            </w:r>
+            <w:r>
+              <w:rPr>
+                <w:b/>
+              </w:rPr>
+              <w:t xml:space="preserve"> hi</w:t>
+            </w:r>
+            <w:r>
+              <w:rPr>
+                <w:b/>
+              </w:rPr>
+              <w:t>ệ</w:t>
+            </w:r>
+            <w:r>
+              <w:rPr>
+                <w:b/>
+              </w:rPr>
+              <w:t>n 4 xe + làm trang tin t</w:t>
+            </w:r>
+            <w:r>
+              <w:rPr>
+                <w:b/>
+              </w:rPr>
+              <w:t>ứ</w:t>
+            </w:r>
+            <w:r>
+              <w:rPr>
+                <w:b/>
+              </w:rPr>
+              <w:t>c thân thi</w:t>
+            </w:r>
+            <w:r>
+              <w:rPr>
+                <w:b/>
+              </w:rPr>
+              <w:t>ệ</w:t>
+            </w:r>
+            <w:r>
+              <w:rPr>
+                <w:b/>
+              </w:rPr>
+              <w:t>n hơn</w:t>
+            </w:r>
+          </w:p>
+          <w:p>
+            <w:r>
+              <w:t>-  V</w:t>
+            </w:r>
+            <w:r>
+              <w:t>ấ</w:t>
+            </w:r>
+            <w:r>
+              <w:t>n đ</w:t>
+            </w:r>
+            <w:r>
+              <w:t>ề</w:t>
+            </w:r>
+            <w:r>
+              <w:t>: trang /driver ch</w:t>
+            </w:r>
+            <w:r>
+              <w:t>ỉ</w:t>
+            </w:r>
+            <w:r>
+              <w:t xml:space="preserve"> hi</w:t>
+            </w:r>
+            <w:r>
+              <w:t>ệ</w:t>
+            </w:r>
+            <w:r>
+              <w:t>n 4/N xe vì regex nh</w:t>
+            </w:r>
+            <w:r>
+              <w:t>ậ</w:t>
+            </w:r>
+            <w:r>
+              <w:t>n di</w:t>
+            </w:r>
+            <w:r>
+              <w:t>ệ</w:t>
+            </w:r>
+            <w:r>
+              <w:t>n bi</w:t>
+            </w:r>
+            <w:r>
+              <w:t>ể</w:t>
+            </w:r>
+            <w:r>
+              <w:t>n s</w:t>
+            </w:r>
+            <w:r>
+              <w:t>ố</w:t>
+            </w:r>
+            <w:r>
+              <w:t xml:space="preserve"> kh</w:t>
+            </w:r>
+            <w:r>
+              <w:t>ớ</w:t>
+            </w:r>
+            <w:r>
+              <w:t>p nh</w:t>
+            </w:r>
+            <w:r>
+              <w:t>ầ</w:t>
+            </w:r>
+            <w:r>
+              <w:t>m v</w:t>
+            </w:r>
+            <w:r>
+              <w:t>ớ</w:t>
+            </w:r>
+            <w:r>
+              <w:t>i mã xe n</w:t>
+            </w:r>
+            <w:r>
+              <w:t>ộ</w:t>
+            </w:r>
+            <w:r>
+              <w:t>i b</w:t>
+            </w:r>
+            <w:r>
+              <w:t>ộ</w:t>
+            </w:r>
+            <w:r>
+              <w:t xml:space="preserve"> (vd "28G") → b</w:t>
+            </w:r>
+            <w:r>
+              <w:t>ị</w:t>
+            </w:r>
+            <w:r>
+              <w:t xml:space="preserve"> dedup m</w:t>
+            </w:r>
+            <w:r>
+              <w:t>ấ</w:t>
+            </w:r>
+            <w:r>
+              <w:t xml:space="preserve">t </w:t>
+            </w:r>
+            <w:r>
+              <w:t>các xe có cùng prefix.</w:t>
+            </w:r>
+          </w:p>
+          <w:p>
+            <w:r>
+              <w:t>-  S</w:t>
+            </w:r>
+            <w:r>
+              <w:t>ử</w:t>
+            </w:r>
+            <w:r>
+              <w:t>a regex: b</w:t>
+            </w:r>
+            <w:r>
+              <w:t>ắ</w:t>
+            </w:r>
+            <w:r>
+              <w:t>t bu</w:t>
+            </w:r>
+            <w:r>
+              <w:t>ộ</w:t>
+            </w:r>
+            <w:r>
+              <w:t>c đ</w:t>
+            </w:r>
+            <w:r>
+              <w:t>ủ</w:t>
+            </w:r>
+            <w:r>
+              <w:t xml:space="preserve"> pattern \d{2}[A-Z][-\s]?\d{3,5} (2 s</w:t>
+            </w:r>
+            <w:r>
+              <w:t>ố</w:t>
+            </w:r>
+            <w:r>
+              <w:t xml:space="preserve"> + 1 ch</w:t>
+            </w:r>
+            <w:r>
+              <w:t>ữ</w:t>
+            </w:r>
+            <w:r>
+              <w:t xml:space="preserve"> + </w:t>
+            </w:r>
+            <w:r>
+              <w:lastRenderedPageBreak/>
+              <w:t>d</w:t>
+            </w:r>
+            <w:r>
+              <w:t>ấ</w:t>
+            </w:r>
+            <w:r>
+              <w:t>u cách + 3-5 s</w:t>
+            </w:r>
+            <w:r>
+              <w:t>ố</w:t>
+            </w:r>
+            <w:r>
+              <w:t>) và ưu tiên trư</w:t>
+            </w:r>
+            <w:r>
+              <w:t>ờ</w:t>
+            </w:r>
+            <w:r>
+              <w:t>ng type trư</w:t>
+            </w:r>
+            <w:r>
+              <w:t>ớ</w:t>
+            </w:r>
+            <w:r>
+              <w:t>c code → hi</w:t>
+            </w:r>
+            <w:r>
+              <w:t>ệ</w:t>
+            </w:r>
+            <w:r>
+              <w:t>n đ</w:t>
+            </w:r>
+            <w:r>
+              <w:t>ủ</w:t>
+            </w:r>
+            <w:r>
+              <w:t xml:space="preserve"> toàn b</w:t>
+            </w:r>
+            <w:r>
+              <w:t>ộ</w:t>
+            </w:r>
+            <w:r>
+              <w:t xml:space="preserve"> xe trong h</w:t>
+            </w:r>
+            <w:r>
+              <w:t>ệ</w:t>
+            </w:r>
+            <w:r>
+              <w:t xml:space="preserve"> th</w:t>
+            </w:r>
+            <w:r>
+              <w:t>ố</w:t>
+            </w:r>
+            <w:r>
+              <w:t>ng.</w:t>
+            </w:r>
+          </w:p>
+          <w:p>
+            <w:r>
+              <w:t>-  Trang /tin-tuc: b</w:t>
+            </w:r>
+            <w:r>
+              <w:t>ỏ</w:t>
+            </w:r>
+            <w:r>
+              <w:t xml:space="preserve"> toàn b</w:t>
+            </w:r>
+            <w:r>
+              <w:t>ộ</w:t>
+            </w:r>
+            <w:r>
+              <w:t xml:space="preserve"> icon/emoji (</w:t>
+            </w:r>
+            <w:r>
+              <w:t>📰</w:t>
+            </w:r>
+            <w:r>
+              <w:t xml:space="preserve"> </w:t>
+            </w:r>
+            <w:r>
+              <w:t>📅</w:t>
+            </w:r>
+            <w:r>
+              <w:t xml:space="preserve"> ✍</w:t>
+            </w:r>
+            <w:r>
+              <w:t>️</w:t>
+            </w:r>
+            <w:r>
+              <w:t>) theo nguyên t</w:t>
+            </w:r>
+            <w:r>
+              <w:t>ắ</w:t>
+            </w:r>
+            <w:r>
+              <w:t>c t</w:t>
+            </w:r>
+            <w:r>
+              <w:t>rang public không dùng emoji, thi</w:t>
+            </w:r>
+            <w:r>
+              <w:t>ế</w:t>
+            </w:r>
+            <w:r>
+              <w:t>t k</w:t>
+            </w:r>
+            <w:r>
+              <w:t>ế</w:t>
+            </w:r>
+            <w:r>
+              <w:t xml:space="preserve"> l</w:t>
+            </w:r>
+            <w:r>
+              <w:t>ạ</w:t>
+            </w:r>
+            <w:r>
+              <w:t>i v</w:t>
+            </w:r>
+            <w:r>
+              <w:t>ớ</w:t>
+            </w:r>
+            <w:r>
+              <w:t>i hero gradient xanh, ô tìm ki</w:t>
+            </w:r>
+            <w:r>
+              <w:t>ế</w:t>
+            </w:r>
+            <w:r>
+              <w:t>m, b</w:t>
+            </w:r>
+            <w:r>
+              <w:t>ộ</w:t>
+            </w:r>
+            <w:r>
+              <w:t xml:space="preserve"> l</w:t>
+            </w:r>
+            <w:r>
+              <w:t>ọ</w:t>
+            </w:r>
+            <w:r>
+              <w:t>c chuyên m</w:t>
+            </w:r>
+            <w:r>
+              <w:t>ụ</w:t>
+            </w:r>
+            <w:r>
+              <w:t>c d</w:t>
+            </w:r>
+            <w:r>
+              <w:t>ạ</w:t>
+            </w:r>
+            <w:r>
+              <w:t>ng pill có đ</w:t>
+            </w:r>
+            <w:r>
+              <w:t>ế</w:t>
+            </w:r>
+            <w:r>
+              <w:t>m s</w:t>
+            </w:r>
+            <w:r>
+              <w:t>ố</w:t>
+            </w:r>
+            <w:r>
+              <w:t xml:space="preserve"> bài, card bo tròn + hover scale </w:t>
+            </w:r>
+            <w:r>
+              <w:t>ả</w:t>
+            </w:r>
+            <w:r>
+              <w:t>nh.</w:t>
+            </w:r>
+          </w:p>
+          <w:p>
+            <w:r>
+              <w:t>-  T</w:t>
+            </w:r>
+            <w:r>
+              <w:t>ổ</w:t>
+            </w:r>
+            <w:r>
+              <w:t>ng H</w:t>
+            </w:r>
+            <w:r>
+              <w:t>ợ</w:t>
+            </w:r>
+            <w:r>
+              <w:t>p: đ</w:t>
+            </w:r>
+            <w:r>
+              <w:t>ổ</w:t>
+            </w:r>
+            <w:r>
+              <w:t>i ô s</w:t>
+            </w:r>
+            <w:r>
+              <w:t>ố</w:t>
+            </w:r>
+            <w:r>
+              <w:t xml:space="preserve"> đi</w:t>
+            </w:r>
+            <w:r>
+              <w:t>ệ</w:t>
+            </w:r>
+            <w:r>
+              <w:t>n tho</w:t>
+            </w:r>
+            <w:r>
+              <w:t>ạ</w:t>
+            </w:r>
+            <w:r>
+              <w:t>i sang n</w:t>
+            </w:r>
+            <w:r>
+              <w:t>ề</w:t>
+            </w:r>
+            <w:r>
+              <w:t>n tr</w:t>
+            </w:r>
+            <w:r>
+              <w:t>ắ</w:t>
+            </w:r>
+            <w:r>
+              <w:t>ng ch</w:t>
+            </w:r>
+            <w:r>
+              <w:t>ữ</w:t>
+            </w:r>
+            <w:r>
+              <w:t xml:space="preserve"> đen khi tr</w:t>
+            </w:r>
+            <w:r>
+              <w:t>ạ</w:t>
+            </w:r>
+            <w:r>
+              <w:t>ng thái "Chưa g</w:t>
+            </w:r>
+            <w:r>
+              <w:t>ọ</w:t>
+            </w:r>
+            <w:r>
+              <w:t>i" đ</w:t>
+            </w:r>
+            <w:r>
+              <w:t>ể</w:t>
+            </w:r>
+            <w:r>
+              <w:t xml:space="preserve"> nhân viên nhìn rõ</w:t>
+            </w:r>
+            <w:r>
+              <w:t xml:space="preserve"> và d</w:t>
+            </w:r>
+            <w:r>
+              <w:t>ễ</w:t>
+            </w:r>
+            <w:r>
+              <w:t xml:space="preserve"> nh</w:t>
+            </w:r>
+            <w:r>
+              <w:t>ấ</w:t>
+            </w:r>
+            <w:r>
+              <w:t>n g</w:t>
+            </w:r>
+            <w:r>
+              <w:t>ọ</w:t>
+            </w:r>
+            <w:r>
+              <w:t>i.</w:t>
+            </w:r>
+          </w:p>
+          <w:p>
+            <w:r>
+              <w:rPr>
+                <w:b/>
+              </w:rPr>
+              <w:t>Tài li</w:t>
+            </w:r>
+            <w:r>
+              <w:rPr>
+                <w:b/>
+              </w:rPr>
+              <w:t>ệ</w:t>
+            </w:r>
+            <w:r>
+              <w:rPr>
+                <w:b/>
+              </w:rPr>
+              <w:t>u đ</w:t>
+            </w:r>
+            <w:r>
+              <w:rPr>
+                <w:b/>
+              </w:rPr>
+              <w:t>ồ</w:t>
+            </w:r>
+            <w:r>
+              <w:rPr>
+                <w:b/>
+              </w:rPr>
+              <w:t xml:space="preserve"> án + tái c</w:t>
+            </w:r>
+            <w:r>
+              <w:rPr>
+                <w:b/>
+              </w:rPr>
+              <w:t>ấ</w:t>
+            </w:r>
+            <w:r>
+              <w:rPr>
+                <w:b/>
+              </w:rPr>
+              <w:t>u trúc thư m</w:t>
+            </w:r>
+            <w:r>
+              <w:rPr>
+                <w:b/>
+              </w:rPr>
+              <w:t>ụ</w:t>
+            </w:r>
+            <w:r>
+              <w:rPr>
+                <w:b/>
+              </w:rPr>
+              <w:t>c monorepo</w:t>
+            </w:r>
+          </w:p>
+          <w:p>
+            <w:r>
+              <w:t>-  Vi</w:t>
+            </w:r>
+            <w:r>
+              <w:t>ế</w:t>
+            </w:r>
+            <w:r>
+              <w:t>t tài li</w:t>
+            </w:r>
+            <w:r>
+              <w:t>ệ</w:t>
+            </w:r>
+            <w:r>
+              <w:t>u đ</w:t>
+            </w:r>
+            <w:r>
+              <w:t>ồ</w:t>
+            </w:r>
+            <w:r>
+              <w:t xml:space="preserve"> án b</w:t>
+            </w:r>
+            <w:r>
+              <w:t>ằ</w:t>
+            </w:r>
+            <w:r>
+              <w:t>ng Markdown + Mermaid: Database Schema, ERD, Use Case Diagram, Sequence Diagram, Mô t</w:t>
+            </w:r>
+            <w:r>
+              <w:t>ả</w:t>
+            </w:r>
+            <w:r>
+              <w:t xml:space="preserve"> nghi</w:t>
+            </w:r>
+            <w:r>
+              <w:t>ệ</w:t>
+            </w:r>
+            <w:r>
+              <w:t>p v</w:t>
+            </w:r>
+            <w:r>
+              <w:t>ụ</w:t>
+            </w:r>
+            <w:r>
+              <w:t xml:space="preserve"> — kèm script export-diagrams.sh t</w:t>
+            </w:r>
+            <w:r>
+              <w:t>ự</w:t>
+            </w:r>
+            <w:r>
+              <w:t xml:space="preserve"> render Mermaid thành PNG đ</w:t>
+            </w:r>
+            <w:r>
+              <w:t>ể</w:t>
+            </w:r>
+            <w:r>
+              <w:t xml:space="preserve"> chèn và</w:t>
+            </w:r>
+            <w:r>
+              <w:t>o Word.</w:t>
+            </w:r>
+          </w:p>
+          <w:p>
+            <w:r>
+              <w:t>-  Đ</w:t>
+            </w:r>
+            <w:r>
+              <w:t>ổ</w:t>
+            </w:r>
+            <w:r>
+              <w:t>i tên th</w:t>
+            </w:r>
+            <w:r>
+              <w:t>ố</w:t>
+            </w:r>
+            <w:r>
+              <w:t>ng nh</w:t>
+            </w:r>
+            <w:r>
+              <w:t>ấ</w:t>
+            </w:r>
+            <w:r>
+              <w:t>t toàn b</w:t>
+            </w:r>
+            <w:r>
+              <w:t>ộ</w:t>
+            </w:r>
+            <w:r>
+              <w:t xml:space="preserve"> folder root theo convention VoCucPhuong_* (VoCucPhuong_PublicWeb, VoCucPhuong_DatVe, VoCucPhuong_NhapHang, VoCucPhuong_TongHop, VoCucPhuong_BackupData, VoCucPhuong_PageOptions) + tên ti</w:t>
+            </w:r>
+            <w:r>
+              <w:t>ế</w:t>
+            </w:r>
+            <w:r>
+              <w:t>ng Vi</w:t>
+            </w:r>
+            <w:r>
+              <w:t>ệ</w:t>
+            </w:r>
+            <w:r>
+              <w:t>t cho tài li</w:t>
+            </w:r>
+            <w:r>
+              <w:t>ệ</w:t>
+            </w:r>
+            <w:r>
+              <w:t>u (BaoCao) và</w:t>
+            </w:r>
+            <w:r>
+              <w:t xml:space="preserve"> công c</w:t>
+            </w:r>
+            <w:r>
+              <w:t>ụ</w:t>
+            </w:r>
+            <w:r>
+              <w:t xml:space="preserve"> (Auto_Update_Data).</w:t>
+            </w:r>
+          </w:p>
+          <w:p>
+            <w:r>
+              <w:t>-  C</w:t>
+            </w:r>
+            <w:r>
+              <w:t>ậ</w:t>
+            </w:r>
+            <w:r>
+              <w:t>p nh</w:t>
+            </w:r>
+            <w:r>
+              <w:t>ậ</w:t>
+            </w:r>
+            <w:r>
+              <w:t>t README + .vscode/settings.json đ</w:t>
+            </w:r>
+            <w:r>
+              <w:t>ể</w:t>
+            </w:r>
+            <w:r>
+              <w:t xml:space="preserve"> </w:t>
+            </w:r>
+            <w:r>
+              <w:t>ẩ</w:t>
+            </w:r>
+            <w:r>
+              <w:t>n các folder ph</w:t>
+            </w:r>
+            <w:r>
+              <w:t>ụ</w:t>
+            </w:r>
+            <w:r>
+              <w:t xml:space="preserve"> tr</w:t>
+            </w:r>
+            <w:r>
+              <w:t>ợ</w:t>
+            </w:r>
+            <w:r>
+              <w:t xml:space="preserve"> (.claude, .next, build, .gradle, .dart_tool...) cho g</w:t>
+            </w:r>
+            <w:r>
+              <w:t>ọ</w:t>
+            </w:r>
+            <w:r>
+              <w:t>n cây thư m</w:t>
+            </w:r>
+            <w:r>
+              <w:t>ụ</w:t>
+            </w:r>
+            <w:r>
+              <w:t>c.</w:t>
+            </w:r>
+          </w:p>
+          <w:p>
+            <w:bookmarkStart w:id="2" w:name="_Hlk232314317"/>
+            <w:r>
+              <w:rPr>
+                <w:b/>
+              </w:rPr>
+              <w:t>T</w:t>
+            </w:r>
+            <w:r>
+              <w:rPr>
+                <w:b/>
+              </w:rPr>
+              <w:t>ố</w:t>
+            </w:r>
+            <w:r>
+              <w:rPr>
+                <w:b/>
+              </w:rPr>
+              <w:t>i ưu hi</w:t>
+            </w:r>
+            <w:r>
+              <w:rPr>
+                <w:b/>
+              </w:rPr>
+              <w:t>ệ</w:t>
+            </w:r>
+            <w:r>
+              <w:rPr>
+                <w:b/>
+              </w:rPr>
+              <w:t>u năng app Flutter (gi</w:t>
+            </w:r>
+            <w:r>
+              <w:rPr>
+                <w:b/>
+              </w:rPr>
+              <w:t>ả</w:t>
+            </w:r>
+            <w:r>
+              <w:rPr>
+                <w:b/>
+              </w:rPr>
+              <w:t>m lag, mư</w:t>
+            </w:r>
+            <w:r>
+              <w:rPr>
+                <w:b/>
+              </w:rPr>
+              <w:t>ợ</w:t>
+            </w:r>
+            <w:r>
+              <w:rPr>
+                <w:b/>
+              </w:rPr>
+              <w:t>t giao di</w:t>
+            </w:r>
+            <w:r>
+              <w:rPr>
+                <w:b/>
+              </w:rPr>
+              <w:t>ệ</w:t>
+            </w:r>
+            <w:r>
+              <w:rPr>
+                <w:b/>
+              </w:rPr>
+              <w:t>n)</w:t>
+            </w:r>
+          </w:p>
+          <w:p>
+            <w:r>
+              <w:t>-  V</w:t>
+            </w:r>
+            <w:r>
+              <w:t>ấ</w:t>
+            </w:r>
+            <w:r>
+              <w:t>n đ</w:t>
+            </w:r>
+            <w:r>
+              <w:t>ề</w:t>
+            </w:r>
+            <w:r>
+              <w:t>: app khi m</w:t>
+            </w:r>
+            <w:r>
+              <w:t>ở</w:t>
+            </w:r>
+            <w:r>
+              <w:t xml:space="preserve"> l</w:t>
+            </w:r>
+            <w:r>
+              <w:t>ầ</w:t>
+            </w:r>
+            <w:r>
+              <w:t>n đ</w:t>
+            </w:r>
+            <w:r>
+              <w:t>ầ</w:t>
+            </w:r>
+            <w:r>
+              <w:t>u và k</w:t>
+            </w:r>
+            <w:r>
+              <w:t>hi chuy</w:t>
+            </w:r>
+            <w:r>
+              <w:t>ể</w:t>
+            </w:r>
+            <w:r>
+              <w:t xml:space="preserve">n tab còn lag, </w:t>
+            </w:r>
+            <w:r>
+              <w:t>ả</w:t>
+            </w:r>
+            <w:r>
+              <w:t>nh load ch</w:t>
+            </w:r>
+            <w:r>
+              <w:t>ậ</w:t>
+            </w:r>
+            <w:r>
+              <w:t>m, WebView tr</w:t>
+            </w:r>
+            <w:r>
+              <w:t>ắ</w:t>
+            </w:r>
+            <w:r>
+              <w:t>ng vài giây m</w:t>
+            </w:r>
+            <w:r>
+              <w:t>ớ</w:t>
+            </w:r>
+            <w:r>
+              <w:t>i hi</w:t>
+            </w:r>
+            <w:r>
+              <w:t>ệ</w:t>
+            </w:r>
+            <w:r>
+              <w:t>n.</w:t>
+            </w:r>
+          </w:p>
+          <w:p>
+            <w:r>
+              <w:t>-  B</w:t>
+            </w:r>
+            <w:r>
+              <w:t>ậ</w:t>
+            </w:r>
+            <w:r>
+              <w:t>t cache cho WebView, preload trang chính khi app kh</w:t>
+            </w:r>
+            <w:r>
+              <w:t>ở</w:t>
+            </w:r>
+            <w:r>
+              <w:t>i đ</w:t>
+            </w:r>
+            <w:r>
+              <w:t>ộ</w:t>
+            </w:r>
+            <w:r>
+              <w:t xml:space="preserve">ng </w:t>
+            </w:r>
+            <w:r>
+              <w:t>ở</w:t>
+            </w:r>
+            <w:r>
+              <w:t xml:space="preserve"> background đ</w:t>
+            </w:r>
+            <w:r>
+              <w:t>ể</w:t>
+            </w:r>
+            <w:r>
+              <w:t xml:space="preserve"> khi user b</w:t>
+            </w:r>
+            <w:r>
+              <w:t>ấ</w:t>
+            </w:r>
+            <w:r>
+              <w:t>m vào tab thì hi</w:t>
+            </w:r>
+            <w:r>
+              <w:t>ệ</w:t>
+            </w:r>
+            <w:r>
+              <w:t>n ngay, không ph</w:t>
+            </w:r>
+            <w:r>
+              <w:t>ả</w:t>
+            </w:r>
+            <w:r>
+              <w:t>i đ</w:t>
+            </w:r>
+            <w:r>
+              <w:t>ợ</w:t>
+            </w:r>
+            <w:r>
+              <w:t>i.</w:t>
+            </w:r>
+          </w:p>
+          <w:p>
+            <w:r>
+              <w:t>-  Lazy-load các tab ph</w:t>
+            </w:r>
+            <w:r>
+              <w:t>ụ</w:t>
+            </w:r>
+            <w:r>
+              <w:t xml:space="preserve"> (ch</w:t>
+            </w:r>
+            <w:r>
+              <w:t>ỉ</w:t>
+            </w:r>
+            <w:r>
+              <w:t xml:space="preserve"> kh</w:t>
+            </w:r>
+            <w:r>
+              <w:t>ở</w:t>
+            </w:r>
+            <w:r>
+              <w:t>i t</w:t>
+            </w:r>
+            <w:r>
+              <w:t>ạ</w:t>
+            </w:r>
+            <w:r>
+              <w:t>o WebView khi ta</w:t>
+            </w:r>
+            <w:r>
+              <w:t>b đư</w:t>
+            </w:r>
+            <w:r>
+              <w:t>ợ</w:t>
+            </w:r>
+            <w:r>
+              <w:t>c m</w:t>
+            </w:r>
+            <w:r>
+              <w:t>ở</w:t>
+            </w:r>
+            <w:r>
+              <w:t xml:space="preserve"> l</w:t>
+            </w:r>
+            <w:r>
+              <w:t>ầ</w:t>
+            </w:r>
+            <w:r>
+              <w:t>n đ</w:t>
+            </w:r>
+            <w:r>
+              <w:t>ầ</w:t>
+            </w:r>
+            <w:r>
+              <w:t>u) — gi</w:t>
+            </w:r>
+            <w:r>
+              <w:t>ả</w:t>
+            </w:r>
+            <w:r>
+              <w:t>m RAM lúc kh</w:t>
+            </w:r>
+            <w:r>
+              <w:t>ở</w:t>
+            </w:r>
+            <w:r>
+              <w:t>i đ</w:t>
+            </w:r>
+            <w:r>
+              <w:t>ộ</w:t>
+            </w:r>
+            <w:r>
+              <w:t>ng, m</w:t>
+            </w:r>
+            <w:r>
+              <w:t>ở</w:t>
+            </w:r>
+            <w:r>
+              <w:t xml:space="preserve"> app nhanh hơn rõ r</w:t>
+            </w:r>
+            <w:r>
+              <w:t>ệ</w:t>
+            </w:r>
+            <w:r>
+              <w:t>t.</w:t>
+            </w:r>
+          </w:p>
+          <w:p>
+            <w:r>
+              <w:t>-  Tr</w:t>
+            </w:r>
+            <w:r>
+              <w:t>ỏ</w:t>
+            </w:r>
+            <w:r>
+              <w:t xml:space="preserve"> th</w:t>
+            </w:r>
+            <w:r>
+              <w:t>ẳ</w:t>
+            </w:r>
+            <w:r>
+              <w:t>ng URL v</w:t>
+            </w:r>
+            <w:r>
+              <w:t>ề</w:t>
+            </w:r>
+            <w:r>
+              <w:t xml:space="preserve"> /nhap-hang/index.html (thay vì /nhap-hang/) đ</w:t>
+            </w:r>
+            <w:r>
+              <w:t>ể</w:t>
+            </w:r>
+            <w:r>
+              <w:t xml:space="preserve"> tránh redirect Vercel làm v</w:t>
+            </w:r>
+            <w:r>
+              <w:t>ỡ</w:t>
+            </w:r>
+            <w:r>
+              <w:t xml:space="preserve"> đư</w:t>
+            </w:r>
+            <w:r>
+              <w:t>ờ</w:t>
+            </w:r>
+            <w:r>
+              <w:t>ng d</w:t>
+            </w:r>
+            <w:r>
+              <w:t>ẫ</w:t>
+            </w:r>
+            <w:r>
+              <w:t>n CSS tương đ</w:t>
+            </w:r>
+            <w:r>
+              <w:t>ố</w:t>
+            </w:r>
+            <w:r>
+              <w:t>i — fix l</w:t>
+            </w:r>
+            <w:r>
+              <w:t>ỗ</w:t>
+            </w:r>
+            <w:r>
+              <w:t>i NhapHang hi</w:t>
+            </w:r>
+            <w:r>
+              <w:t>ệ</w:t>
+            </w:r>
+            <w:r>
+              <w:t>n không có style trong app.</w:t>
+            </w:r>
+          </w:p>
+          <w:p>
+            <w:bookmarkStart w:id="3" w:name="_Hlk232314361"/>
+            <w:bookmarkEnd w:id="2"/>
+            <w:r>
+              <w:rPr>
+                <w:b/>
+              </w:rPr>
+              <w:t>S</w:t>
+            </w:r>
+            <w:r>
+              <w:rPr>
+                <w:b/>
+              </w:rPr>
+              <w:t>ử</w:t>
+            </w:r>
+            <w:r>
+              <w:rPr>
+                <w:b/>
+              </w:rPr>
+              <w:t>a quy ư</w:t>
+            </w:r>
+            <w:r>
+              <w:rPr>
+                <w:b/>
+              </w:rPr>
+              <w:t>ớ</w:t>
+            </w:r>
+            <w:r>
+              <w:rPr>
+                <w:b/>
+              </w:rPr>
+              <w:t>c sinh</w:t>
+            </w:r>
+            <w:r>
+              <w:rPr>
+                <w:b/>
+              </w:rPr>
+              <w:t xml:space="preserve"> mã đơn hàng NhapHang (YYMMDD.SSNN theo tr</w:t>
+            </w:r>
+            <w:r>
+              <w:rPr>
+                <w:b/>
+              </w:rPr>
+              <w:t>ạ</w:t>
+            </w:r>
+            <w:r>
+              <w:rPr>
+                <w:b/>
+              </w:rPr>
+              <w:t>m NH</w:t>
+            </w:r>
+            <w:r>
+              <w:rPr>
+                <w:b/>
+              </w:rPr>
+              <w:t>Ậ</w:t>
+            </w:r>
+            <w:r>
+              <w:rPr>
+                <w:b/>
+              </w:rPr>
+              <w:t>N)</w:t>
+            </w:r>
+          </w:p>
+          <w:p>
+            <w:r>
+              <w:t>-  V</w:t>
+            </w:r>
+            <w:r>
+              <w:t>ấ</w:t>
+            </w:r>
+            <w:r>
+              <w:t>n đ</w:t>
+            </w:r>
+            <w:r>
+              <w:t>ề</w:t>
+            </w:r>
+            <w:r>
+              <w:t>: mã đơn cũ sinh client-side d</w:t>
+            </w:r>
+            <w:r>
+              <w:t>ễ</w:t>
+            </w:r>
+            <w:r>
+              <w:t xml:space="preserve"> trùng khi 2 nhân viên thao tác cùng lúc, và l</w:t>
+            </w:r>
+            <w:r>
+              <w:t>ấ</w:t>
+            </w:r>
+            <w:r>
+              <w:t>y nh</w:t>
+            </w:r>
+            <w:r>
+              <w:t>ầ</w:t>
+            </w:r>
+            <w:r>
+              <w:t>m theo tr</w:t>
+            </w:r>
+            <w:r>
+              <w:t>ạ</w:t>
+            </w:r>
+            <w:r>
+              <w:t>m g</w:t>
+            </w:r>
+            <w:r>
+              <w:t>ử</w:t>
+            </w:r>
+            <w:r>
+              <w:t>i nên th</w:t>
+            </w:r>
+            <w:r>
+              <w:t>ố</w:t>
+            </w:r>
+            <w:r>
+              <w:t>ng kê theo tr</w:t>
+            </w:r>
+            <w:r>
+              <w:t>ạ</w:t>
+            </w:r>
+            <w:r>
+              <w:t>m nh</w:t>
+            </w:r>
+            <w:r>
+              <w:t>ậ</w:t>
+            </w:r>
+            <w:r>
+              <w:t>n b</w:t>
+            </w:r>
+            <w:r>
+              <w:t>ị</w:t>
+            </w:r>
+            <w:r>
+              <w:t xml:space="preserve"> l</w:t>
+            </w:r>
+            <w:r>
+              <w:t>ệ</w:t>
+            </w:r>
+            <w:r>
+              <w:t>ch.</w:t>
+            </w:r>
+          </w:p>
+          <w:p>
+            <w:r>
+              <w:t>-  Đ</w:t>
+            </w:r>
+            <w:r>
+              <w:t>ổ</w:t>
+            </w:r>
+            <w:r>
+              <w:t>i format mã: YYMMDD.SSNN — SS là mã tr</w:t>
+            </w:r>
+            <w:r>
+              <w:t>ạ</w:t>
+            </w:r>
+            <w:r>
+              <w:t>m NH</w:t>
+            </w:r>
+            <w:r>
+              <w:t>Ậ</w:t>
+            </w:r>
+            <w:r>
+              <w:t>N t</w:t>
+            </w:r>
+            <w:r>
+              <w:t>ừ</w:t>
+            </w:r>
+            <w:r>
+              <w:t xml:space="preserve"> dropdo</w:t>
+            </w:r>
+            <w:r>
+              <w:t>wn, NN là s</w:t>
+            </w:r>
+            <w:r>
+              <w:t>ố</w:t>
+            </w:r>
+            <w:r>
+              <w:t xml:space="preserve"> th</w:t>
+            </w:r>
+            <w:r>
+              <w:t>ứ</w:t>
+            </w:r>
+            <w:r>
+              <w:t xml:space="preserve"> t</w:t>
+            </w:r>
+            <w:r>
+              <w:t>ự</w:t>
+            </w:r>
+            <w:r>
+              <w:t xml:space="preserve"> trong ngày. Server sinh mã chính th</w:t>
+            </w:r>
+            <w:r>
+              <w:t>ứ</w:t>
+            </w:r>
+            <w:r>
+              <w:t>c qua atomic upsert vào b</w:t>
+            </w:r>
+            <w:r>
+              <w:t>ả</w:t>
+            </w:r>
+            <w:r>
+              <w:t>ng counters → không bao gi</w:t>
+            </w:r>
+            <w:r>
+              <w:t>ờ</w:t>
+            </w:r>
+            <w:r>
+              <w:t xml:space="preserve"> trùng k</w:t>
+            </w:r>
+            <w:r>
+              <w:t>ể</w:t>
+            </w:r>
+            <w:r>
+              <w:t xml:space="preserve"> c</w:t>
+            </w:r>
+            <w:r>
+              <w:t>ả</w:t>
+            </w:r>
+            <w:r>
+              <w:t xml:space="preserve"> khi nh</w:t>
+            </w:r>
+            <w:r>
+              <w:t>ậ</w:t>
+            </w:r>
+            <w:r>
+              <w:t xml:space="preserve">p </w:t>
+            </w:r>
+            <w:r>
+              <w:lastRenderedPageBreak/>
+              <w:t>song song.</w:t>
+            </w:r>
+          </w:p>
+          <w:p>
+            <w:r>
+              <w:t>-  Client ch</w:t>
+            </w:r>
+            <w:r>
+              <w:t>ỉ</w:t>
+            </w:r>
+            <w:r>
+              <w:t xml:space="preserve"> g</w:t>
+            </w:r>
+            <w:r>
+              <w:t>ọ</w:t>
+            </w:r>
+            <w:r>
+              <w:t>i GET /api/nhap-hang/counters?station=XX đ</w:t>
+            </w:r>
+            <w:r>
+              <w:t>ể</w:t>
+            </w:r>
+            <w:r>
+              <w:t xml:space="preserve"> preview mã s</w:t>
+            </w:r>
+            <w:r>
+              <w:t>ắ</w:t>
+            </w:r>
+            <w:r>
+              <w:t>p t</w:t>
+            </w:r>
+            <w:r>
+              <w:t>ớ</w:t>
+            </w:r>
+            <w:r>
+              <w:t>i, mã th</w:t>
+            </w:r>
+            <w:r>
+              <w:t>ậ</w:t>
+            </w:r>
+            <w:r>
+              <w:t>t do server c</w:t>
+            </w:r>
+            <w:r>
+              <w:t>ấ</w:t>
+            </w:r>
+            <w:r>
+              <w:t>p lúc POST → t</w:t>
+            </w:r>
+            <w:r>
+              <w:t>ránh race condition.</w:t>
+            </w:r>
+          </w:p>
+          <w:p>
+            <w:r>
+              <w:rPr>
+                <w:b/>
+              </w:rPr>
+              <w:t>Soft-delete đơn hàng + audit log ngư</w:t>
+            </w:r>
+            <w:r>
+              <w:rPr>
+                <w:b/>
+              </w:rPr>
+              <w:t>ờ</w:t>
+            </w:r>
+            <w:r>
+              <w:rPr>
+                <w:b/>
+              </w:rPr>
+              <w:t>i s</w:t>
+            </w:r>
+            <w:r>
+              <w:rPr>
+                <w:b/>
+              </w:rPr>
+              <w:t>ử</w:t>
+            </w:r>
+            <w:r>
+              <w:rPr>
+                <w:b/>
+              </w:rPr>
+              <w:t>a (NhapHang)</w:t>
+            </w:r>
+          </w:p>
+          <w:p>
+            <w:r>
+              <w:t>-  V</w:t>
+            </w:r>
+            <w:r>
+              <w:t>ấ</w:t>
+            </w:r>
+            <w:r>
+              <w:t>n đ</w:t>
+            </w:r>
+            <w:r>
+              <w:t>ề</w:t>
+            </w:r>
+            <w:r>
+              <w:t>: nút "Xóa" trư</w:t>
+            </w:r>
+            <w:r>
+              <w:t>ớ</w:t>
+            </w:r>
+            <w:r>
+              <w:t>c đây xoá vĩnh vi</w:t>
+            </w:r>
+            <w:r>
+              <w:t>ễ</w:t>
+            </w:r>
+            <w:r>
+              <w:t>n → m</w:t>
+            </w:r>
+            <w:r>
+              <w:t>ấ</w:t>
+            </w:r>
+            <w:r>
+              <w:t>t d</w:t>
+            </w:r>
+            <w:r>
+              <w:t>ấ</w:t>
+            </w:r>
+            <w:r>
+              <w:t>u v</w:t>
+            </w:r>
+            <w:r>
+              <w:t>ế</w:t>
+            </w:r>
+            <w:r>
+              <w:t>t, khó tra c</w:t>
+            </w:r>
+            <w:r>
+              <w:t>ứ</w:t>
+            </w:r>
+            <w:r>
+              <w:t>u khi khách khi</w:t>
+            </w:r>
+            <w:r>
+              <w:t>ế</w:t>
+            </w:r>
+            <w:r>
+              <w:t>u n</w:t>
+            </w:r>
+            <w:r>
+              <w:t>ạ</w:t>
+            </w:r>
+            <w:r>
+              <w:t>i.</w:t>
+            </w:r>
+          </w:p>
+          <w:p>
+            <w:r>
+              <w:t>-  Đ</w:t>
+            </w:r>
+            <w:r>
+              <w:t>ổ</w:t>
+            </w:r>
+            <w:r>
+              <w:t>i sang soft-delete: b</w:t>
+            </w:r>
+            <w:r>
+              <w:t>ấ</w:t>
+            </w:r>
+            <w:r>
+              <w:t>m Xóa th</w:t>
+            </w:r>
+            <w:r>
+              <w:t>ự</w:t>
+            </w:r>
+            <w:r>
+              <w:t>c ra set status=cancelled, có modal ghi chú lý do h</w:t>
+            </w:r>
+            <w:r>
+              <w:t>ủ</w:t>
+            </w:r>
+            <w:r>
+              <w:t>y. Đơn h</w:t>
+            </w:r>
+            <w:r>
+              <w:t>ủ</w:t>
+            </w:r>
+            <w:r>
+              <w:t>y hi</w:t>
+            </w:r>
+            <w:r>
+              <w:t>ể</w:t>
+            </w:r>
+            <w:r>
+              <w:t>n th</w:t>
+            </w:r>
+            <w:r>
+              <w:t>ị</w:t>
+            </w:r>
+            <w:r>
+              <w:t xml:space="preserve"> màu xám + g</w:t>
+            </w:r>
+            <w:r>
+              <w:t>ạ</w:t>
+            </w:r>
+            <w:r>
+              <w:t>ch ngang, không cho ch</w:t>
+            </w:r>
+            <w:r>
+              <w:t>ỉ</w:t>
+            </w:r>
+            <w:r>
+              <w:t>nh s</w:t>
+            </w:r>
+            <w:r>
+              <w:t>ử</w:t>
+            </w:r>
+            <w:r>
+              <w:t>a/in, không tính vào doanh thu/th</w:t>
+            </w:r>
+            <w:r>
+              <w:t>ố</w:t>
+            </w:r>
+            <w:r>
+              <w:t>ng kê dashboard.</w:t>
+            </w:r>
+          </w:p>
+          <w:p>
+            <w:r>
+              <w:t>-  G</w:t>
+            </w:r>
+            <w:r>
+              <w:t>ắ</w:t>
+            </w:r>
+            <w:r>
+              <w:t>n audit log: m</w:t>
+            </w:r>
+            <w:r>
+              <w:t>ỗ</w:t>
+            </w:r>
+            <w:r>
+              <w:t>i l</w:t>
+            </w:r>
+            <w:r>
+              <w:t>ầ</w:t>
+            </w:r>
+            <w:r>
+              <w:t>n update/delete đ</w:t>
+            </w:r>
+            <w:r>
+              <w:t>ề</w:t>
+            </w:r>
+            <w:r>
+              <w:t>u g</w:t>
+            </w:r>
+            <w:r>
+              <w:t>ử</w:t>
+            </w:r>
+            <w:r>
+              <w:t>i changedBy l</w:t>
+            </w:r>
+            <w:r>
+              <w:t>ấ</w:t>
+            </w:r>
+            <w:r>
+              <w:t>y t</w:t>
+            </w:r>
+            <w:r>
+              <w:t>ừ</w:t>
+            </w:r>
+            <w:r>
+              <w:t xml:space="preserve"> user đang đăng nh</w:t>
+            </w:r>
+            <w:r>
+              <w:t>ậ</w:t>
+            </w:r>
+            <w:r>
+              <w:t>p → tra ra ai s</w:t>
+            </w:r>
+            <w:r>
+              <w:t>ử</w:t>
+            </w:r>
+            <w:r>
+              <w:t>a đơn nào lúc nào trong b</w:t>
+            </w:r>
+            <w:r>
+              <w:t>ả</w:t>
+            </w:r>
+            <w:r>
+              <w:t>ng productlogs.</w:t>
+            </w:r>
+          </w:p>
+          <w:p>
+            <w:r>
+              <w:rPr>
+                <w:b/>
+              </w:rPr>
+              <w:t>H</w:t>
+            </w:r>
+            <w:r>
+              <w:rPr>
+                <w:b/>
+              </w:rPr>
+              <w:t>ệ</w:t>
+            </w:r>
+            <w:r>
+              <w:rPr>
+                <w:b/>
+              </w:rPr>
+              <w:t xml:space="preserve"> t</w:t>
+            </w:r>
+            <w:r>
+              <w:rPr>
+                <w:b/>
+              </w:rPr>
+              <w:t>h</w:t>
+            </w:r>
+            <w:r>
+              <w:rPr>
+                <w:b/>
+              </w:rPr>
+              <w:t>ố</w:t>
+            </w:r>
+            <w:r>
+              <w:rPr>
+                <w:b/>
+              </w:rPr>
+              <w:t>ng phân quy</w:t>
+            </w:r>
+            <w:r>
+              <w:rPr>
+                <w:b/>
+              </w:rPr>
+              <w:t>ề</w:t>
+            </w:r>
+            <w:r>
+              <w:rPr>
+                <w:b/>
+              </w:rPr>
+              <w:t>n + đăng nh</w:t>
+            </w:r>
+            <w:r>
+              <w:rPr>
+                <w:b/>
+              </w:rPr>
+              <w:t>ậ</w:t>
+            </w:r>
+            <w:r>
+              <w:rPr>
+                <w:b/>
+              </w:rPr>
+              <w:t>p cho 2 module (NhapHang &amp; TongHop)</w:t>
+            </w:r>
+          </w:p>
+          <w:p>
+            <w:r>
+              <w:t>-  Thêm c</w:t>
+            </w:r>
+            <w:r>
+              <w:t>ộ</w:t>
+            </w:r>
+            <w:r>
+              <w:t>t permissions JSONB vào b</w:t>
+            </w:r>
+            <w:r>
+              <w:t>ả</w:t>
+            </w:r>
+            <w:r>
+              <w:t>ng Users c</w:t>
+            </w:r>
+            <w:r>
+              <w:t>ủ</w:t>
+            </w:r>
+            <w:r>
+              <w:t>a c</w:t>
+            </w:r>
+            <w:r>
+              <w:t>ả</w:t>
+            </w:r>
+            <w:r>
+              <w:t xml:space="preserve"> 2 DB, kèm scope theo tr</w:t>
+            </w:r>
+            <w:r>
+              <w:t>ạ</w:t>
+            </w:r>
+            <w:r>
+              <w:t>m (m</w:t>
+            </w:r>
+            <w:r>
+              <w:t>ỗ</w:t>
+            </w:r>
+            <w:r>
+              <w:t>i user ch</w:t>
+            </w:r>
+            <w:r>
+              <w:t>ỉ</w:t>
+            </w:r>
+            <w:r>
+              <w:t xml:space="preserve"> th</w:t>
+            </w:r>
+            <w:r>
+              <w:t>ấ</w:t>
+            </w:r>
+            <w:r>
+              <w:t>y đơn c</w:t>
+            </w:r>
+            <w:r>
+              <w:t>ủ</w:t>
+            </w:r>
+            <w:r>
+              <w:t>a tr</w:t>
+            </w:r>
+            <w:r>
+              <w:t>ạ</w:t>
+            </w:r>
+            <w:r>
+              <w:t>m mình, tr</w:t>
+            </w:r>
+            <w:r>
+              <w:t>ừ</w:t>
+            </w:r>
+            <w:r>
+              <w:t xml:space="preserve"> admin global).</w:t>
+            </w:r>
+          </w:p>
+          <w:p>
+            <w:r>
+              <w:t>-  TongHop: 15 quy</w:t>
+            </w:r>
+            <w:r>
+              <w:t>ề</w:t>
+            </w:r>
+            <w:r>
+              <w:t>n chi ti</w:t>
+            </w:r>
+            <w:r>
+              <w:t>ế</w:t>
+            </w:r>
+            <w:r>
+              <w:t>t (xem booking, s</w:t>
+            </w:r>
+            <w:r>
+              <w:t>ử</w:t>
+            </w:r>
+            <w:r>
+              <w:t>a booking, h</w:t>
+            </w:r>
+            <w:r>
+              <w:t>ủ</w:t>
+            </w:r>
+            <w:r>
+              <w:t>y, chuy</w:t>
+            </w:r>
+            <w:r>
+              <w:t>ể</w:t>
+            </w:r>
+            <w:r>
+              <w:t>n gh</w:t>
+            </w:r>
+            <w:r>
+              <w:t>ế</w:t>
+            </w:r>
+            <w:r>
+              <w:t>, qu</w:t>
+            </w:r>
+            <w:r>
+              <w:t>ả</w:t>
+            </w:r>
+            <w:r>
+              <w:t>n lý route, qu</w:t>
+            </w:r>
+            <w:r>
+              <w:t>ả</w:t>
+            </w:r>
+            <w:r>
+              <w:t>n lý xe, xem doanh thu, qu</w:t>
+            </w:r>
+            <w:r>
+              <w:t>ả</w:t>
+            </w:r>
+            <w:r>
+              <w:t xml:space="preserve">n lý user…) — JWT mang theo permissions, hàm hasPerm() check </w:t>
+            </w:r>
+            <w:r>
+              <w:t>ở</w:t>
+            </w:r>
+            <w:r>
+              <w:t xml:space="preserve"> m</w:t>
+            </w:r>
+            <w:r>
+              <w:t>ỗ</w:t>
+            </w:r>
+            <w:r>
+              <w:t>i route.</w:t>
+            </w:r>
+          </w:p>
+          <w:p>
+            <w:r>
+              <w:t>-  NhapHang: helper hasPerm() + hasGlobalStationAccess() phân bi</w:t>
+            </w:r>
+            <w:r>
+              <w:t>ệ</w:t>
+            </w:r>
+            <w:r>
+              <w:t>t user tr</w:t>
+            </w:r>
+            <w:r>
+              <w:t>ạ</w:t>
+            </w:r>
+            <w:r>
+              <w:t>m vs admin t</w:t>
+            </w:r>
+            <w:r>
+              <w:t>ổ</w:t>
+            </w:r>
+            <w:r>
+              <w:t>ng. M</w:t>
+            </w:r>
+            <w:r>
+              <w:t>ậ</w:t>
+            </w:r>
+            <w:r>
+              <w:t>t kh</w:t>
+            </w:r>
+            <w:r>
+              <w:t>ẩ</w:t>
+            </w:r>
+            <w:r>
+              <w:t>u cũ plain-text t</w:t>
+            </w:r>
+            <w:r>
+              <w:t>ự</w:t>
+            </w:r>
+            <w:r>
+              <w:t xml:space="preserve"> reha</w:t>
+            </w:r>
+            <w:r>
+              <w:t>sh sang bcrypt khi user đăng nh</w:t>
+            </w:r>
+            <w:r>
+              <w:t>ậ</w:t>
+            </w:r>
+            <w:r>
+              <w:t>p l</w:t>
+            </w:r>
+            <w:r>
+              <w:t>ầ</w:t>
+            </w:r>
+            <w:r>
+              <w:t>n đ</w:t>
+            </w:r>
+            <w:r>
+              <w:t>ầ</w:t>
+            </w:r>
+            <w:r>
+              <w:t>u — migrate d</w:t>
+            </w:r>
+            <w:r>
+              <w:t>ầ</w:t>
+            </w:r>
+            <w:r>
+              <w:t>n không c</w:t>
+            </w:r>
+            <w:r>
+              <w:t>ầ</w:t>
+            </w:r>
+            <w:r>
+              <w:t>n reset password.</w:t>
+            </w:r>
+          </w:p>
+          <w:p>
+            <w:r>
+              <w:t>-  Trang /quan-ly-user (admin only) cho phép tick ch</w:t>
+            </w:r>
+            <w:r>
+              <w:t>ọ</w:t>
+            </w:r>
+            <w:r>
+              <w:t>n quy</w:t>
+            </w:r>
+            <w:r>
+              <w:t>ề</w:t>
+            </w:r>
+            <w:r>
+              <w:t>n + đ</w:t>
+            </w:r>
+            <w:r>
+              <w:t>ổ</w:t>
+            </w:r>
+            <w:r>
+              <w:t>i scope tr</w:t>
+            </w:r>
+            <w:r>
+              <w:t>ạ</w:t>
+            </w:r>
+            <w:r>
+              <w:t>m b</w:t>
+            </w:r>
+            <w:r>
+              <w:t>ằ</w:t>
+            </w:r>
+            <w:r>
+              <w:t>ng UI, không c</w:t>
+            </w:r>
+            <w:r>
+              <w:t>ầ</w:t>
+            </w:r>
+            <w:r>
+              <w:t>n SQL tay.</w:t>
+            </w:r>
+            <w:bookmarkEnd w:id="3"/>
           </w:p>
         </w:tc>
       </w:tr>
@@ -905,11 +3357,6 @@
     <w:lsdException w:name="Book Title" w:uiPriority="33" w:qFormat="1"/>
     <w:lsdException w:name="Bibliography" w:semiHidden="1" w:uiPriority="37" w:unhideWhenUsed="1"/>
     <w:lsdException w:name="TOC Heading" w:semiHidden="1" w:uiPriority="39" w:unhideWhenUsed="1" w:qFormat="1"/>
-    <w:lsdException w:name="Plain Table 5" w:semiHidden="1" w:unhideWhenUsed="1"/>
-    <w:lsdException w:name="Grid Table Light" w:semiHidden="1" w:unhideWhenUsed="1"/>
-    <w:lsdException w:name="Grid Table 1 Light" w:semiHidden="1" w:unhideWhenUsed="1"/>
-    <w:lsdException w:name="Grid Table 2" w:semiHidden="1" w:unhideWhenUsed="1"/>
-    <w:lsdException w:name="Grid Table 3" w:semiHidden="1" w:unhideWhenUsed="1"/>
     <w:lsdException w:name="Grid Table 4" w:uiPriority="49"/>
     <w:lsdException w:name="Grid Table 5 Dark" w:uiPriority="50"/>
     <w:lsdException w:name="Grid Table 6 Colorful" w:uiPriority="51"/>

</xml_diff>